<commit_message>
Site updated: 2023-11-21 22:00:03
</commit_message>
<xml_diff>
--- a/treasure/download/经藏/涅槃部-23部/佛垂般涅槃略说教诫经-姚秦-鸠摩罗什.docx
+++ b/treasure/download/经藏/涅槃部-23部/佛垂般涅槃略说教诫经-姚秦-鸠摩罗什.docx
@@ -13,7 +13,6 @@
           <w:lang w:eastAsia="zh-CN"/>
         </w:rPr>
       </w:pPr>
-      <w:bookmarkStart w:id="0" w:name="_GoBack"/>
       <w:r>
         <w:rPr>
           <w:sz w:val="24"/>
@@ -385,7 +384,28 @@
           <w:shd w:val="pct15" w:color="auto" w:fill="FFFFFF"/>
           <w:lang w:eastAsia="zh-CN"/>
         </w:rPr>
-        <w:t>心为其主。是故汝等当好制心。心之可畏甚于毒蛇恶兽怨贼大火越逸。未足喻也。动转轻躁</w:t>
+        <w:t>心为其主。是故汝等当好制心。心之可畏甚于毒蛇</w:t>
+      </w:r>
+      <w:r>
+        <w:rPr>
+          <w:rFonts w:hint="eastAsia"/>
+          <w:sz w:val="24"/>
+          <w:szCs w:val="24"/>
+          <w:shd w:val="pct15" w:color="auto" w:fill="FFFFFF"/>
+          <w:lang w:eastAsia="zh-CN"/>
+        </w:rPr>
+        <w:t>。</w:t>
+      </w:r>
+      <w:bookmarkStart w:id="0" w:name="_GoBack"/>
+      <w:bookmarkEnd w:id="0"/>
+      <w:r>
+        <w:rPr>
+          <w:sz w:val="24"/>
+          <w:szCs w:val="24"/>
+          <w:shd w:val="pct15" w:color="auto" w:fill="FFFFFF"/>
+          <w:lang w:eastAsia="zh-CN"/>
+        </w:rPr>
+        <w:t>恶兽怨贼大火越逸。未足喻也。动转轻躁</w:t>
       </w:r>
       <w:r>
         <w:rPr>
@@ -1255,7 +1275,6 @@
         </w:rPr>
         <w:t>我欲灭度。是我最后之所教诲。</w:t>
       </w:r>
-      <w:bookmarkEnd w:id="0"/>
     </w:p>
     <w:sectPr>
       <w:pgSz w:w="12240" w:h="15840"/>
@@ -13255,7 +13274,7 @@
 </file>
 
 <file path=customXml/itemProps1.xml><?xml version="1.0" encoding="utf-8"?>
-<ds:datastoreItem xmlns:ds="http://schemas.openxmlformats.org/officeDocument/2006/customXml" ds:itemID="{DCD85033-1EEB-4E95-B552-E24B7B98FAE7}">
+<ds:datastoreItem xmlns:ds="http://schemas.openxmlformats.org/officeDocument/2006/customXml" ds:itemID="{D4999EAE-75FC-45CB-B215-286F3D7B25F5}">
   <ds:schemaRefs>
     <ds:schemaRef ds:uri="http://schemas.openxmlformats.org/officeDocument/2006/bibliography"/>
   </ds:schemaRefs>

</xml_diff>